<commit_message>
Firmware v4.01: BOOT-Taster fuer WLAN-AP und CRSF-Router fuer Modulketten
- BOOT-Taster 3 s schaltet den WLAN-AP um (erst nach Loslassen nach dem Boot)
- Router: A -> B/C ausser Extended-Frames an die eigene Adresse, B/C -> A,
  nie B <-> C; ganze Frames mit CRC-Pruefung, Warteschlange 8 Frames je Port
- Doppelte Modul-Adresse: Doppelblitz (S3) und Warnung im Debug-Tab
- Fix: Parser-Zustand UART A bleibt zwischen Loop-Durchlaeufen erhalten
- UART-Puffer 1024/512 Byte, Router-Zaehler in der Web-UI
- README und Projektbeschreibung auf v4.01

Co-Authored-By: Claude Opus 5.5 (1M context) <noreply@anthropic.com>
Claude-Session: https://claude.ai/code/session_017Lns5pPfH18AXUiHEWcrs9
</commit_message>
<xml_diff>
--- a/docs/Projektbeschreibung.docx
+++ b/docs/Projektbeschreibung.docx
@@ -538,55 +538,55 @@
         <w:pStyle w:val="Heading1"/>
       </w:pPr>
       <w:r>
-        <w:t xml:space="preserve">Firmware (geplant)</w:t>
-      </w:r>
-    </w:p>
-    <w:p>
-      <w:pPr>
-        <w:pStyle w:val="ListParagraph"/>
-        <w:numPr>
-          <w:ilvl w:val="0"/>
-          <w:numId w:val="2"/>
-        </w:numPr>
-      </w:pPr>
-      <w:r>
-        <w:t xml:space="preserve">CRSF als einziges Protokoll, busfaehig ueber die UART-Anschluesse (Eingang plus Weiterleitung zum naechsten Modul).</w:t>
-      </w:r>
-    </w:p>
-    <w:p>
-      <w:pPr>
-        <w:pStyle w:val="ListParagraph"/>
-        <w:numPr>
-          <w:ilvl w:val="0"/>
-          <w:numId w:val="2"/>
-        </w:numPr>
-      </w:pPr>
-      <w:r>
-        <w:t xml:space="preserve">Gemeinsame CRSF-Bibliothek als Kopie im Projekt (firmware/lib), keine externe Abhaengigkeit.</w:t>
-      </w:r>
-    </w:p>
-    <w:p>
-      <w:pPr>
-        <w:pStyle w:val="ListParagraph"/>
-        <w:numPr>
-          <w:ilvl w:val="0"/>
-          <w:numId w:val="2"/>
-        </w:numPr>
-      </w:pPr>
-      <w:r>
-        <w:t xml:space="preserve">Einstellung der Adresse und Parameter ueber CRSF-Parameter (Lua am Sender) und Web-UI.</w:t>
-      </w:r>
-    </w:p>
-    <w:p>
-      <w:pPr>
-        <w:pStyle w:val="ListParagraph"/>
-        <w:numPr>
-          <w:ilvl w:val="0"/>
-          <w:numId w:val="2"/>
-        </w:numPr>
-      </w:pPr>
-      <w:r>
-        <w:t xml:space="preserve">Build mit PlatformIO, Bauweise wie bei den Sound-Mini-Repos.</w:t>
+        <w:t xml:space="preserve">Firmware (v4.01)</w:t>
+      </w:r>
+    </w:p>
+    <w:p>
+      <w:pPr>
+        <w:pStyle w:val="ListParagraph"/>
+        <w:numPr>
+          <w:ilvl w:val="0"/>
+          <w:numId w:val="2"/>
+        </w:numPr>
+      </w:pPr>
+      <w:r>
+        <w:t xml:space="preserve">Arduino-Sketch firmware/CRSF_Multiswitch, gleicher Quellcode fuer C3 und S3 (Board wird automatisch erkannt). Basis: MultiSwitch_ESP32_V3 v3.12.</w:t>
+      </w:r>
+    </w:p>
+    <w:p>
+      <w:pPr>
+        <w:pStyle w:val="ListParagraph"/>
+        <w:numPr>
+          <w:ilvl w:val="0"/>
+          <w:numId w:val="2"/>
+        </w:numPr>
+      </w:pPr>
+      <w:r>
+        <w:t xml:space="preserve">CRSF auf UART A, wahlweise SBUS. Modulkette ueber UART B (und UART C beim S3), Router mit CRC-Pruefung und Sendewarteschlange je Port.</w:t>
+      </w:r>
+    </w:p>
+    <w:p>
+      <w:pPr>
+        <w:pStyle w:val="ListParagraph"/>
+        <w:numPr>
+          <w:ilvl w:val="0"/>
+          <w:numId w:val="2"/>
+        </w:numPr>
+      </w:pPr>
+      <w:r>
+        <w:t xml:space="preserve">Jedes Modul der Kette hat eine eigene Adresse (0-15) und ist ueber Lua am Sender und ueber die Web-UI einzeln einstellbar.</w:t>
+      </w:r>
+    </w:p>
+    <w:p>
+      <w:pPr>
+        <w:pStyle w:val="ListParagraph"/>
+        <w:numPr>
+          <w:ilvl w:val="0"/>
+          <w:numId w:val="2"/>
+        </w:numPr>
+      </w:pPr>
+      <w:r>
+        <w:t xml:space="preserve">BOOT-Taster 3 s: WLAN-AP ein/aus. Status-LED (nur S3): aus, 500 ms, schnell bei Failsafe, Doppelblitz bei doppelter Adresse.</w:t>
       </w:r>
     </w:p>
     <w:p>
@@ -618,7 +618,7 @@
         </w:numPr>
       </w:pPr>
       <w:r>
-        <w:t xml:space="preserve">firmware/: Firmware (PlatformIO), noch nicht begonnen</w:t>
+        <w:t xml:space="preserve">firmware/: Firmware v4.01 (Arduino-Sketch, Details in firmware/README.md)</w:t>
       </w:r>
     </w:p>
     <w:p>
@@ -674,7 +674,7 @@
         </w:numPr>
       </w:pPr>
       <w:r>
-        <w:t xml:space="preserve">Firmware: noch nicht begonnen.</w:t>
+        <w:t xml:space="preserve">Firmware: v4.01 kompiliert fuer C3 und S3, noch nicht auf Hardware getestet.</w:t>
       </w:r>
     </w:p>
     <w:p>
@@ -718,7 +718,7 @@
         </w:numPr>
       </w:pPr>
       <w:r>
-        <w:t xml:space="preserve">Firmware schreiben</w:t>
+        <w:t xml:space="preserve">Firmware auf Hardware testen (Einzelmodul und Kette mit 2-3 Modulen)</w:t>
       </w:r>
     </w:p>
     <w:sectPr>

</xml_diff>